<commit_message>
ADD+EDIT: Poster, Presentation + Poster Webpage setup
</commit_message>
<xml_diff>
--- a/_site/all_combined_data.docx
+++ b/_site/all_combined_data.docx
@@ -916,7 +916,7 @@
       </w:tr>
     </w:tbl>
     <w:bookmarkEnd w:id="31"/>
-    <w:bookmarkStart w:id="35" w:name="bubble-plot-of-the-observers"/>
+    <w:bookmarkStart w:id="38" w:name="bubble-plot-of-the-observers"/>
     <w:p>
       <w:pPr>
         <w:pStyle w:val="Heading2"/>
@@ -960,6 +960,17 @@
       </w:r>
       <w:r>
         <w:t xml:space="preserve">hover name is the alias, and text is the alias.</w:t>
+      </w:r>
+    </w:p>
+    <w:p>
+      <w:pPr>
+        <w:pStyle w:val="SourceCode"/>
+      </w:pPr>
+      <w:r>
+        <w:rPr>
+          <w:rStyle w:val="VerbatimChar"/>
+        </w:rPr>
+        <w:t xml:space="preserve">✅ Saved static snapshot to /Users/kalugoduc/projects/report-farsun-github/report-farsun/figures/observer_bubble.png</w:t>
       </w:r>
     </w:p>
     <w:tbl>
@@ -1091,8 +1102,55 @@
         </w:tc>
       </w:tr>
     </w:tbl>
-    <w:bookmarkEnd w:id="35"/>
-    <w:bookmarkStart w:id="37" w:name="animated-bubble-plot-of-the-observers"/>
+    <w:p>
+      <w:pPr>
+        <w:pStyle w:val="BodyText"/>
+      </w:pPr>
+      <w:r>
+        <w:drawing>
+          <wp:inline>
+            <wp:extent cx="4267200" cy="3200400"/>
+            <wp:effectExtent b="0" l="0" r="0" t="0"/>
+            <wp:docPr descr="" title="" id="36" name="Picture"/>
+            <a:graphic>
+              <a:graphicData uri="http://schemas.openxmlformats.org/drawingml/2006/picture">
+                <pic:pic>
+                  <pic:nvPicPr>
+                    <pic:cNvPr descr="./figures/observer_bubble.png" id="37" name="Picture"/>
+                    <pic:cNvPicPr>
+                      <a:picLocks noChangeArrowheads="1" noChangeAspect="1"/>
+                    </pic:cNvPicPr>
+                  </pic:nvPicPr>
+                  <pic:blipFill>
+                    <a:blip r:embed="rId35"/>
+                    <a:stretch>
+                      <a:fillRect/>
+                    </a:stretch>
+                  </pic:blipFill>
+                  <pic:spPr bwMode="auto">
+                    <a:xfrm>
+                      <a:off x="0" y="0"/>
+                      <a:ext cx="4267200" cy="3200400"/>
+                    </a:xfrm>
+                    <a:prstGeom prst="rect">
+                      <a:avLst/>
+                    </a:prstGeom>
+                    <a:noFill/>
+                    <a:ln w="9525">
+                      <a:noFill/>
+                      <a:headEnd/>
+                      <a:tailEnd/>
+                    </a:ln>
+                  </pic:spPr>
+                </pic:pic>
+              </a:graphicData>
+            </a:graphic>
+          </wp:inline>
+        </w:drawing>
+      </w:r>
+    </w:p>
+    <w:bookmarkEnd w:id="38"/>
+    <w:bookmarkStart w:id="40" w:name="animated-bubble-plot-of-the-observers"/>
     <w:p>
       <w:pPr>
         <w:pStyle w:val="Heading2"/>
@@ -1150,7 +1208,7 @@
       <w:tr>
         <w:tc>
           <w:tcPr/>
-          <w:bookmarkStart w:id="36" w:name="Xe2c2def6337bbd5be27f29b0162928ffad5a2cc"/>
+          <w:bookmarkStart w:id="39" w:name="Xe2c2def6337bbd5be27f29b0162928ffad5a2cc"/>
           <w:p>
             <w:pPr>
               <w:pStyle w:val="SourceCode"/>
@@ -1176,11 +1234,11 @@
               <w:t xml:space="preserve">Figure 3: Animated bubble plot showing all observers in all combined data.</w:t>
             </w:r>
           </w:p>
-          <w:bookmarkEnd w:id="36"/>
+          <w:bookmarkEnd w:id="39"/>
         </w:tc>
       </w:tr>
     </w:tbl>
-    <w:bookmarkEnd w:id="37"/>
+    <w:bookmarkEnd w:id="40"/>
     <w:sectPr>
       <w:footnotePr>
         <w:numRestart w:val="eachSect"/>

</xml_diff>

<commit_message>
TAG: Version 1 of the Poster-Webpage
</commit_message>
<xml_diff>
--- a/_site/all_combined_data.docx
+++ b/_site/all_combined_data.docx
@@ -916,7 +916,7 @@
       </w:tr>
     </w:tbl>
     <w:bookmarkEnd w:id="31"/>
-    <w:bookmarkStart w:id="38" w:name="bubble-plot-of-the-observers"/>
+    <w:bookmarkStart w:id="35" w:name="bubble-plot-of-the-observers"/>
     <w:p>
       <w:pPr>
         <w:pStyle w:val="Heading2"/>
@@ -970,7 +970,7 @@
         <w:rPr>
           <w:rStyle w:val="VerbatimChar"/>
         </w:rPr>
-        <w:t xml:space="preserve">✅ Saved static snapshot to /Users/kalugoduc/projects/report-farsun-github/report-farsun/figures/observer_bubble.png</w:t>
+        <w:t xml:space="preserve">✅ Saved static snapshot to /Users/kalugoduc/projects/report-farsun/figures/observer_bubble_1.png</w:t>
       </w:r>
     </w:p>
     <w:tbl>
@@ -1102,55 +1102,8 @@
         </w:tc>
       </w:tr>
     </w:tbl>
-    <w:p>
-      <w:pPr>
-        <w:pStyle w:val="BodyText"/>
-      </w:pPr>
-      <w:r>
-        <w:drawing>
-          <wp:inline>
-            <wp:extent cx="4267200" cy="3200400"/>
-            <wp:effectExtent b="0" l="0" r="0" t="0"/>
-            <wp:docPr descr="" title="" id="36" name="Picture"/>
-            <a:graphic>
-              <a:graphicData uri="http://schemas.openxmlformats.org/drawingml/2006/picture">
-                <pic:pic>
-                  <pic:nvPicPr>
-                    <pic:cNvPr descr="./figures/observer_bubble.png" id="37" name="Picture"/>
-                    <pic:cNvPicPr>
-                      <a:picLocks noChangeArrowheads="1" noChangeAspect="1"/>
-                    </pic:cNvPicPr>
-                  </pic:nvPicPr>
-                  <pic:blipFill>
-                    <a:blip r:embed="rId35"/>
-                    <a:stretch>
-                      <a:fillRect/>
-                    </a:stretch>
-                  </pic:blipFill>
-                  <pic:spPr bwMode="auto">
-                    <a:xfrm>
-                      <a:off x="0" y="0"/>
-                      <a:ext cx="4267200" cy="3200400"/>
-                    </a:xfrm>
-                    <a:prstGeom prst="rect">
-                      <a:avLst/>
-                    </a:prstGeom>
-                    <a:noFill/>
-                    <a:ln w="9525">
-                      <a:noFill/>
-                      <a:headEnd/>
-                      <a:tailEnd/>
-                    </a:ln>
-                  </pic:spPr>
-                </pic:pic>
-              </a:graphicData>
-            </a:graphic>
-          </wp:inline>
-        </w:drawing>
-      </w:r>
-    </w:p>
-    <w:bookmarkEnd w:id="38"/>
-    <w:bookmarkStart w:id="40" w:name="animated-bubble-plot-of-the-observers"/>
+    <w:bookmarkEnd w:id="35"/>
+    <w:bookmarkStart w:id="37" w:name="animated-bubble-plot-of-the-observers"/>
     <w:p>
       <w:pPr>
         <w:pStyle w:val="Heading2"/>
@@ -1208,7 +1161,7 @@
       <w:tr>
         <w:tc>
           <w:tcPr/>
-          <w:bookmarkStart w:id="39" w:name="Xe2c2def6337bbd5be27f29b0162928ffad5a2cc"/>
+          <w:bookmarkStart w:id="36" w:name="Xe2c2def6337bbd5be27f29b0162928ffad5a2cc"/>
           <w:p>
             <w:pPr>
               <w:pStyle w:val="SourceCode"/>
@@ -1234,11 +1187,11 @@
               <w:t xml:space="preserve">Figure 3: Animated bubble plot showing all observers in all combined data.</w:t>
             </w:r>
           </w:p>
-          <w:bookmarkEnd w:id="39"/>
+          <w:bookmarkEnd w:id="36"/>
         </w:tc>
       </w:tr>
     </w:tbl>
-    <w:bookmarkEnd w:id="40"/>
+    <w:bookmarkEnd w:id="37"/>
     <w:sectPr>
       <w:footnotePr>
         <w:numRestart w:val="eachSect"/>

</xml_diff>